<commit_message>
design_document.docx: itemise every section into numbered points
Each of the 6 sections now leads with an explicit bulleted breakdown:
- System Architecture  → SA-01..SA-12
- Database / Data Design → DB-01..DB-10
- UI/UX Design → UX-01..UX-11 (+ per-component table + wireframe)
- Flowchart / Use Case → UC-01..UC-11 (use cases) + F-01..F-11 (per-image flow)
FR / NFR stay as coded tables (FR-01..FR-14 / NFR-01..NFR-10).
Content checked against pipeline.py / app.py.

Co-Authored-By: Claude Sonnet 5 <noreply@anthropic.com>
Claude-Session: https://claude.ai/code/session_01Pm3sZ7QAUbSbwBWZWYBev3
</commit_message>
<xml_diff>
--- a/docs/design_document.docx
+++ b/docs/design_document.docx
@@ -1086,7 +1086,175 @@
     </w:p>
     <w:p>
       <w:r>
-        <w:t>สถาปัตยกรรม 2 ขั้น: Stage 1 (DMS46, pre-trained TorchScript) หาพื้นที่ที่เป็นโลหะ → แปลงเป็น regions (+fallback ทั้งภาพเมื่อ metal_ratio &lt; 0.05) → Stage 2 (YOLO11s เทรนเอง, grayscale) ตรวจตำหนิบนแต่ละ region → cross-region NMS → กรอง per-class threshold → วาดผล + บันทึก. ทำงานบนเครื่องเดียว ไม่มี backend service แยกและไม่มีฐานข้อมูล.</w:t>
+        <w:t>องค์ประกอบสถาปัตยกรรม (แยกเป็นข้อ):</w:t>
+      </w:r>
+    </w:p>
+    <w:p>
+      <w:pPr>
+        <w:pStyle w:val="ListBullet"/>
+      </w:pPr>
+      <w:r>
+        <w:rPr>
+          <w:b/>
+        </w:rPr>
+        <w:t xml:space="preserve">SA-01  </w:t>
+      </w:r>
+      <w:r>
+        <w:t>อินเทอร์เฟซ 2 ทาง: Web UI (Gradio, app.py) และ CLI (pipeline.py __main__) — ทั้งคู่เรียก pipeline core ตัวเดียวกัน</w:t>
+      </w:r>
+    </w:p>
+    <w:p>
+      <w:pPr>
+        <w:pStyle w:val="ListBullet"/>
+      </w:pPr>
+      <w:r>
+        <w:rPr>
+          <w:b/>
+        </w:rPr>
+        <w:t xml:space="preserve">SA-02  </w:t>
+      </w:r>
+      <w:r>
+        <w:t>Pipeline Core (pipeline.py) เป็นตัวประสาน: โหลดโมเดล, เรียก Stage 1/2, ทำ NMS, กรอง threshold, วาดผล/บันทึก</w:t>
+      </w:r>
+    </w:p>
+    <w:p>
+      <w:pPr>
+        <w:pStyle w:val="ListBullet"/>
+      </w:pPr>
+      <w:r>
+        <w:rPr>
+          <w:b/>
+        </w:rPr>
+        <w:t xml:space="preserve">SA-03  </w:t>
+      </w:r>
+      <w:r>
+        <w:t>Stage 1 — DMS46 (Apple Dense Material Segmentation, pre-trained TorchScript): resize ด้านยาว 512 + ImageNet normalize → label map 46 วัสดุ → เลือก index 22 ("Metal") → binary mask</w:t>
+      </w:r>
+    </w:p>
+    <w:p>
+      <w:pPr>
+        <w:pStyle w:val="ListBullet"/>
+      </w:pPr>
+      <w:r>
+        <w:rPr>
+          <w:b/>
+        </w:rPr>
+        <w:t xml:space="preserve">SA-04  </w:t>
+      </w:r>
+      <w:r>
+        <w:t>Region extraction (mask_to_boxes): morphology + findContours + กรองด้วยพื้นที่/สัดส่วน + รวมกรอบที่อยู่ติดกัน → list ของ (x, y, w, h)</w:t>
+      </w:r>
+    </w:p>
+    <w:p>
+      <w:pPr>
+        <w:pStyle w:val="ListBullet"/>
+      </w:pPr>
+      <w:r>
+        <w:rPr>
+          <w:b/>
+        </w:rPr>
+        <w:t xml:space="preserve">SA-05  </w:t>
+      </w:r>
+      <w:r>
+        <w:t>Fallback (build_regions): ถ้า metal_ratio &lt; 0.05 หรือไม่พบกรอบ → เพิ่มกรอบ = ทั้งภาพ เพื่อไม่พลาดตำหนิ</w:t>
+      </w:r>
+    </w:p>
+    <w:p>
+      <w:pPr>
+        <w:pStyle w:val="ListBullet"/>
+      </w:pPr>
+      <w:r>
+        <w:rPr>
+          <w:b/>
+        </w:rPr>
+        <w:t xml:space="preserve">SA-06  </w:t>
+      </w:r>
+      <w:r>
+        <w:t>Stage 2 — YOLO11s เทรนเองบน dataset รวม 8 คลาส (grayscale, run: train-gray-s) รันตรวจตำหนิบนแต่ละ region</w:t>
+      </w:r>
+    </w:p>
+    <w:p>
+      <w:pPr>
+        <w:pStyle w:val="ListBullet"/>
+      </w:pPr>
+      <w:r>
+        <w:rPr>
+          <w:b/>
+        </w:rPr>
+        <w:t xml:space="preserve">SA-07  </w:t>
+      </w:r>
+      <w:r>
+        <w:t>Grayscale guard (run_stage2): ตรวจจาก checkpoint ว่าโมเดลเทรนบน grayscale หรือไม่ ถ้าใช่แปลง crop เป็น grayscale ก่อน predict (กัน train/serve skew)</w:t>
+      </w:r>
+    </w:p>
+    <w:p>
+      <w:pPr>
+        <w:pStyle w:val="ListBullet"/>
+      </w:pPr>
+      <w:r>
+        <w:rPr>
+          <w:b/>
+        </w:rPr>
+        <w:t xml:space="preserve">SA-08  </w:t>
+      </w:r>
+      <w:r>
+        <w:t>Cross-region NMS (cross_region_nms): แปลง bbox เป็นพิกัดภาพเต็ม แล้วตัด detection ซ้ำข้าม region (คลาสเดียวกัน, IoU &gt; 0.5)</w:t>
+      </w:r>
+    </w:p>
+    <w:p>
+      <w:pPr>
+        <w:pStyle w:val="ListBullet"/>
+      </w:pPr>
+      <w:r>
+        <w:rPr>
+          <w:b/>
+        </w:rPr>
+        <w:t xml:space="preserve">SA-09  </w:t>
+      </w:r>
+      <w:r>
+        <w:t>Per-class threshold (load_class_conf): กรอง detection ที่ confidence ต่ำกว่าเกณฑ์รายคลาสจาก thresholds.json (ถ้ามี)</w:t>
+      </w:r>
+    </w:p>
+    <w:p>
+      <w:pPr>
+        <w:pStyle w:val="ListBullet"/>
+      </w:pPr>
+      <w:r>
+        <w:rPr>
+          <w:b/>
+        </w:rPr>
+        <w:t xml:space="preserve">SA-10  </w:t>
+      </w:r>
+      <w:r>
+        <w:t>Output: วาดกรอบ + ป้ายไทย + ความเสี่ยง → UI (4 output) หรือไฟล์ *_result.jpg / *_result.json (CLI)</w:t>
+      </w:r>
+    </w:p>
+    <w:p>
+      <w:pPr>
+        <w:pStyle w:val="ListBullet"/>
+      </w:pPr>
+      <w:r>
+        <w:rPr>
+          <w:b/>
+        </w:rPr>
+        <w:t xml:space="preserve">SA-11  </w:t>
+      </w:r>
+      <w:r>
+        <w:t>External: DMS46_v1.pt (Apple), Ultralytics YOLO runtime + yolo11s.pt, ระบบไฟล์ท้องถิ่น — ไม่มี API เครือข่าย</w:t>
+      </w:r>
+    </w:p>
+    <w:p>
+      <w:pPr>
+        <w:pStyle w:val="ListBullet"/>
+      </w:pPr>
+      <w:r>
+        <w:rPr>
+          <w:b/>
+        </w:rPr>
+        <w:t xml:space="preserve">SA-12  </w:t>
+      </w:r>
+      <w:r>
+        <w:t>Deployment: เครื่องเดียว (Windows 11 + RTX 3050 6GB, Python 3.11 venv) — ไม่มี server / ฐานข้อมูล / cloud</w:t>
       </w:r>
     </w:p>
     <w:p>
@@ -1386,7 +1554,147 @@
     </w:p>
     <w:p>
       <w:r>
-        <w:t>ระบบ ไม่มีฐานข้อมูล (ไม่มี RDBMS / NoSQL / ORM). เหตุผล: เป็น prototype รันในเครื่องเดียว, ประมวลผลแบบ batch/ต่อคำขอ, ไม่มีผู้ใช้หลายคนหรือสถานะที่ต้อง persist ร่วมกัน. ข้อมูลทั้งหมด persist เป็น ไฟล์ บนระบบไฟล์ท้องถิ่น. หัวข้อนี้จึงเป็น Conceptual Data Model + พจนานุกรมข้อมูล (data dictionary) ของไฟล์เหล่านั้น.</w:t>
+        <w:t>รายการข้อมูลที่ระบบเก็บ (แยกเป็นข้อ — ไม่มี DBMS, persist เป็นไฟล์ทั้งหมด):</w:t>
+      </w:r>
+    </w:p>
+    <w:p>
+      <w:pPr>
+        <w:pStyle w:val="ListBullet"/>
+      </w:pPr>
+      <w:r>
+        <w:rPr>
+          <w:b/>
+        </w:rPr>
+        <w:t xml:space="preserve">DB-01  </w:t>
+      </w:r>
+      <w:r>
+        <w:t>ไม่มี DBMS (RDBMS/NoSQL/ORM) — เป็น prototype เครื่องเดียว ประมวลผลต่อคำขอ ไม่มีสถานะร่วมหลายผู้ใช้</w:t>
+      </w:r>
+    </w:p>
+    <w:p>
+      <w:pPr>
+        <w:pStyle w:val="ListBullet"/>
+      </w:pPr>
+      <w:r>
+        <w:rPr>
+          <w:b/>
+        </w:rPr>
+        <w:t xml:space="preserve">DB-02  </w:t>
+      </w:r>
+      <w:r>
+        <w:t>RESULT — ไฟล์ *_result.json ต่อภาพ: image (path), metal_regions, metal_area_ratio, fallback_full_image, regions[]</w:t>
+      </w:r>
+    </w:p>
+    <w:p>
+      <w:pPr>
+        <w:pStyle w:val="ListBullet"/>
+      </w:pPr>
+      <w:r>
+        <w:rPr>
+          <w:b/>
+        </w:rPr>
+        <w:t xml:space="preserve">DB-03  </w:t>
+      </w:r>
+      <w:r>
+        <w:t>REGION — embedded ใน RESULT.regions[]: region_id (คีย์), box_xywh[4], detections[]</w:t>
+      </w:r>
+    </w:p>
+    <w:p>
+      <w:pPr>
+        <w:pStyle w:val="ListBullet"/>
+      </w:pPr>
+      <w:r>
+        <w:rPr>
+          <w:b/>
+        </w:rPr>
+        <w:t xml:space="preserve">DB-04  </w:t>
+      </w:r>
+      <w:r>
+        <w:t>DETECTION — embedded ใน REGION.detections[]: class (→ DEFECT_CLASS), confidence, bbox_xywh, bbox_xyxy_crop, bbox_xyxy_global, region_id</w:t>
+      </w:r>
+    </w:p>
+    <w:p>
+      <w:pPr>
+        <w:pStyle w:val="ListBullet"/>
+      </w:pPr>
+      <w:r>
+        <w:rPr>
+          <w:b/>
+        </w:rPr>
+        <w:t xml:space="preserve">DB-05  </w:t>
+      </w:r>
+      <w:r>
+        <w:t>DEFECT_CLASS — คงที่ในโค้ด (DEFECT_CLASSES + DEFECT_INFO): id 0–7, name, name_th, risk</w:t>
+      </w:r>
+    </w:p>
+    <w:p>
+      <w:pPr>
+        <w:pStyle w:val="ListBullet"/>
+      </w:pPr>
+      <w:r>
+        <w:rPr>
+          <w:b/>
+        </w:rPr>
+        <w:t xml:space="preserve">DB-06  </w:t>
+      </w:r>
+      <w:r>
+        <w:t>DATASET_IMAGE — ไฟล์ภาพเทรน: filename (คีย์), split {train/valid/test}; width/height อ่านตอนโหลด ไม่เก็บ</w:t>
+      </w:r>
+    </w:p>
+    <w:p>
+      <w:pPr>
+        <w:pStyle w:val="ListBullet"/>
+      </w:pPr>
+      <w:r>
+        <w:rPr>
+          <w:b/>
+        </w:rPr>
+        <w:t xml:space="preserve">DB-07  </w:t>
+      </w:r>
+      <w:r>
+        <w:t>LABEL_BOX — ไฟล์ &lt;split&gt;/labels/*.txt (YOLO): class_id, xc, yc, w, h (normalized) บรรทัดละกล่อง</w:t>
+      </w:r>
+    </w:p>
+    <w:p>
+      <w:pPr>
+        <w:pStyle w:val="ListBullet"/>
+      </w:pPr>
+      <w:r>
+        <w:rPr>
+          <w:b/>
+        </w:rPr>
+        <w:t xml:space="preserve">DB-08  </w:t>
+      </w:r>
+      <w:r>
+        <w:t>REAL_TEST_LABEL — real_test/labels.csv: filename, classes (คั่นด้วย ; — ระดับภาพ) สำหรับ evaluate_real.py</w:t>
+      </w:r>
+    </w:p>
+    <w:p>
+      <w:pPr>
+        <w:pStyle w:val="ListBullet"/>
+      </w:pPr>
+      <w:r>
+        <w:rPr>
+          <w:b/>
+        </w:rPr>
+        <w:t xml:space="preserve">DB-09  </w:t>
+      </w:r>
+      <w:r>
+        <w:t>ไฟล์ config/ผลการทดลอง: data.yaml, data_oversampled.yaml, thresholds.json, results/stage2_*.json, results/stage1_dms46_test.json, _index.json</w:t>
+      </w:r>
+    </w:p>
+    <w:p>
+      <w:pPr>
+        <w:pStyle w:val="ListBullet"/>
+      </w:pPr>
+      <w:r>
+        <w:rPr>
+          <w:b/>
+        </w:rPr>
+        <w:t xml:space="preserve">DB-10  </w:t>
+      </w:r>
+      <w:r>
+        <w:t>ความสัมพันธ์: RESULT 1–N REGION ; REGION 1–N DETECTION ; DETECTION N–1 DEFECT_CLASS ; DATASET_IMAGE 1–N LABEL_BOX ; LABEL_BOX N–1 DEFECT_CLASS</w:t>
       </w:r>
     </w:p>
     <w:p>
@@ -1848,44 +2156,6 @@
       </w:tr>
     </w:tbl>
     <w:p>
-      <w:pPr>
-        <w:pStyle w:val="Heading2"/>
-      </w:pPr>
-      <w:r>
-        <w:t>4.3 รูปแบบไฟล์</w:t>
-      </w:r>
-    </w:p>
-    <w:p>
-      <w:r>
-        <w:t>• *_result.json — JSON ซ้อน (RESULT › regions[] › detections[]) เขียนโดย process_image()</w:t>
-      </w:r>
-    </w:p>
-    <w:p>
-      <w:r>
-        <w:t>• _index.json — array ของ RESULT ทั้งชุด (โหมด --folder)</w:t>
-      </w:r>
-    </w:p>
-    <w:p>
-      <w:r>
-        <w:t>• labels/*.txt — YOLO format: "&lt;class_id&gt; &lt;xc&gt; &lt;yc&gt; &lt;w&gt; &lt;h&gt;" (normalized) บรรทัดละ 1 กล่อง</w:t>
-      </w:r>
-    </w:p>
-    <w:p>
-      <w:r>
-        <w:t>• real_test/labels.csv — header "filename,classes" ; classes คั่นด้วย ; ; "none" = ไม่มีตำหนิ</w:t>
-      </w:r>
-    </w:p>
-    <w:p>
-      <w:r>
-        <w:t>• data.yaml / data_oversampled.yaml — config ของ Ultralytics (path, train/val/test, nc, names)</w:t>
-      </w:r>
-    </w:p>
-    <w:p>
-      <w:r>
-        <w:t>• thresholds.json, results/stage2_*.json, results/stage1_dms46_test.json — ผลการทดลอง (เก็บถาวร)</w:t>
-      </w:r>
-    </w:p>
-    <w:p>
       <w:r>
         <w:br w:type="page"/>
       </w:r>
@@ -1900,7 +2170,161 @@
     </w:p>
     <w:p>
       <w:r>
-        <w:t>UI เดียว: หน้าเว็บ Gradio (gr.Blocks) เปิดที่ http://127.0.0.1:7860 — ออกแบบให้ flow สั้นที่สุด สำหรับพนักงานคัดกรอง: อัปโหลดภาพ → (ปรับ threshold ถ้าต้อง) → กด "ตรวจสอบ" → อ่านผล.</w:t>
+        <w:t>ข้อกำหนดและการออกแบบ UI (แยกเป็นข้อ):</w:t>
+      </w:r>
+    </w:p>
+    <w:p>
+      <w:pPr>
+        <w:pStyle w:val="ListBullet"/>
+      </w:pPr>
+      <w:r>
+        <w:rPr>
+          <w:b/>
+        </w:rPr>
+        <w:t xml:space="preserve">UX-01  </w:t>
+      </w:r>
+      <w:r>
+        <w:t>หน้าเดียว (Gradio gr.Blocks) ที่ http://127.0.0.1:7860 — ไม่มีล็อกอิน ไม่มีหลายหน้า</w:t>
+      </w:r>
+    </w:p>
+    <w:p>
+      <w:pPr>
+        <w:pStyle w:val="ListBullet"/>
+      </w:pPr>
+      <w:r>
+        <w:rPr>
+          <w:b/>
+        </w:rPr>
+        <w:t xml:space="preserve">UX-02  </w:t>
+      </w:r>
+      <w:r>
+        <w:t>Flow เดียว: อัปโหลดภาพ → (ปรับ confidence / เปิดตรวจละเอียด ถ้าต้อง) → กด "ตรวจสอบ" → อ่านผล</w:t>
+      </w:r>
+    </w:p>
+    <w:p>
+      <w:pPr>
+        <w:pStyle w:val="ListBullet"/>
+      </w:pPr>
+      <w:r>
+        <w:rPr>
+          <w:b/>
+        </w:rPr>
+        <w:t xml:space="preserve">UX-03  </w:t>
+      </w:r>
+      <w:r>
+        <w:t>Layout: แถวบน = 2 คอลัมน์ (ซ้าย input, ขวา output ข้อความ+ตาราง) ; แถวล่าง = ภาพผลลัพธ์ + ภาพ Stage 1</w:t>
+      </w:r>
+    </w:p>
+    <w:p>
+      <w:pPr>
+        <w:pStyle w:val="ListBullet"/>
+      </w:pPr>
+      <w:r>
+        <w:rPr>
+          <w:b/>
+        </w:rPr>
+        <w:t xml:space="preserve">UX-04  </w:t>
+      </w:r>
+      <w:r>
+        <w:t>โหลดโมเดลครั้งเดียวตอนเปิดแอป (_ensure_models) — ไม่ค้างเงียบ ๆ ตอนกดปุ่มครั้งแรก ; มี gr.Progress ระหว่างประมวลผล</w:t>
+      </w:r>
+    </w:p>
+    <w:p>
+      <w:pPr>
+        <w:pStyle w:val="ListBullet"/>
+      </w:pPr>
+      <w:r>
+        <w:rPr>
+          <w:b/>
+        </w:rPr>
+        <w:t xml:space="preserve">UX-05  </w:t>
+      </w:r>
+      <w:r>
+        <w:t>สรุปผล (verdict) เน้น "ความเสี่ยง" ก่อนชนิด — ไฮไลต์ตำหนิเสี่ยงสูง (rust, crack)</w:t>
+      </w:r>
+    </w:p>
+    <w:p>
+      <w:pPr>
+        <w:pStyle w:val="ListBullet"/>
+      </w:pPr>
+      <w:r>
+        <w:rPr>
+          <w:b/>
+        </w:rPr>
+        <w:t xml:space="preserve">UX-06  </w:t>
+      </w:r>
+      <w:r>
+        <w:t>ตารางตำหนิเรียงตามความเสี่ยง (สูง→ต่ำ) แล้วตามความมั่นใจ — ผู้ใช้เห็นสิ่งสำคัญก่อน</w:t>
+      </w:r>
+    </w:p>
+    <w:p>
+      <w:pPr>
+        <w:pStyle w:val="ListBullet"/>
+      </w:pPr>
+      <w:r>
+        <w:rPr>
+          <w:b/>
+        </w:rPr>
+        <w:t xml:space="preserve">UX-07  </w:t>
+      </w:r>
+      <w:r>
+        <w:t>แสดงภาพ Stage 1 (overlay เขียว = เหล็ก, ส้ม = fallback) ให้ผู้ใช้เข้าใจว่าระบบ "มองเห็นเหล็กตรงไหน"</w:t>
+      </w:r>
+    </w:p>
+    <w:p>
+      <w:pPr>
+        <w:pStyle w:val="ListBullet"/>
+      </w:pPr>
+      <w:r>
+        <w:rPr>
+          <w:b/>
+        </w:rPr>
+        <w:t xml:space="preserve">UX-08  </w:t>
+      </w:r>
+      <w:r>
+        <w:t>ข้อความ/ป้ายทั้งหมดเป็นภาษาไทย (วาดบนภาพผ่าน PIL + tahoma.ttf เพราะ cv2.putText ไม่รองรับไทย)</w:t>
+      </w:r>
+    </w:p>
+    <w:p>
+      <w:pPr>
+        <w:pStyle w:val="ListBullet"/>
+      </w:pPr>
+      <w:r>
+        <w:rPr>
+          <w:b/>
+        </w:rPr>
+        <w:t xml:space="preserve">UX-09  </w:t>
+      </w:r>
+      <w:r>
+        <w:t>มี gr.Examples (test_images/) ให้กดลองได้ทันทีโดยไม่ต้องหาไฟล์</w:t>
+      </w:r>
+    </w:p>
+    <w:p>
+      <w:pPr>
+        <w:pStyle w:val="ListBullet"/>
+      </w:pPr>
+      <w:r>
+        <w:rPr>
+          <w:b/>
+        </w:rPr>
+        <w:t xml:space="preserve">UX-10  </w:t>
+      </w:r>
+      <w:r>
+        <w:t>รองรับภาพหลายรูปแบบ (grayscale/RGBA) — แปลงให้ภายในไม่ให้ผู้ใช้ต้องจัดการเอง</w:t>
+      </w:r>
+    </w:p>
+    <w:p>
+      <w:pPr>
+        <w:pStyle w:val="ListBullet"/>
+      </w:pPr>
+      <w:r>
+        <w:rPr>
+          <w:b/>
+        </w:rPr>
+        <w:t xml:space="preserve">UX-11  </w:t>
+      </w:r>
+      <w:r>
+        <w:t>ข้อความกำกับชัดเจนว่าเป็น prototype "ผู้ช่วยคัดกรอง" ไม่ใช่ระบบตัดสินขั้นสุดท้าย</w:t>
       </w:r>
     </w:p>
     <w:p>
@@ -1955,7 +2379,7 @@
         <w:pStyle w:val="Heading2"/>
       </w:pPr>
       <w:r>
-        <w:t>5.2 องค์ประกอบและพฤติกรรม</w:t>
+        <w:t>5.2 องค์ประกอบ UI ทีละส่วน</w:t>
       </w:r>
     </w:p>
     <w:tbl>
@@ -2220,7 +2644,7 @@
           </w:tcPr>
           <w:p>
             <w:r>
-              <w:t>⚠️ พบตำหนิ N ชนิด / 🔴 ความเสี่ยงสูง / ✅ ไม่พบ + Stage1 % + จำนวนจุด + device</w:t>
+              <w:t>"พบตำหนิ N ชนิด" / "ความเสี่ยงสูง: ..." / "ไม่พบตำหนิ" + Stage1 % + จำนวนจุด + device</w:t>
             </w:r>
           </w:p>
         </w:tc>
@@ -2323,39 +2747,6 @@
       </w:tr>
     </w:tbl>
     <w:p>
-      <w:pPr>
-        <w:pStyle w:val="Heading2"/>
-      </w:pPr>
-      <w:r>
-        <w:t>5.3 หลักการออกแบบ (UX decisions)</w:t>
-      </w:r>
-    </w:p>
-    <w:p>
-      <w:r>
-        <w:t>• โหลดโมเดลครั้งเดียวตอนเปิดแอป (ไม่หน่วงตอนกดปุ่มครั้งแรกแบบเงียบ ๆ)</w:t>
-      </w:r>
-    </w:p>
-    <w:p>
-      <w:r>
-        <w:t>• เน้น "ความเสี่ยง" ไม่ใช่แค่ชนิด — สรุปผลไฮไลต์ตำหนิเสี่ยงสูง (rust, crack) ก่อน</w:t>
-      </w:r>
-    </w:p>
-    <w:p>
-      <w:r>
-        <w:t>• แสดงภาพ Stage 1 ให้ผู้ใช้เห็นว่าระบบ "มองเห็นเหล็กตรงไหน" — ช่วยตีความผลและ debug</w:t>
-      </w:r>
-    </w:p>
-    <w:p>
-      <w:r>
-        <w:t>• ข้อความ/ป้ายทั้งหมดเป็นภาษาไทย (วาดผ่าน PIL + tahoma.ttf เพราะ cv2.putText ไม่รองรับไทย)</w:t>
-      </w:r>
-    </w:p>
-    <w:p>
-      <w:r>
-        <w:t>• ไม่มีขั้นตอนล็อกอิน/ตั้งค่าซับซ้อน — 1 ปุ่มเดียวได้ผล</w:t>
-      </w:r>
-    </w:p>
-    <w:p>
       <w:r>
         <w:br w:type="page"/>
       </w:r>
@@ -2373,7 +2764,161 @@
         <w:pStyle w:val="Heading2"/>
       </w:pPr>
       <w:r>
-        <w:t>6.1 Use Case Diagram</w:t>
+        <w:t>6.1 Use Case — แยกเป็นข้อ</w:t>
+      </w:r>
+    </w:p>
+    <w:p>
+      <w:pPr>
+        <w:pStyle w:val="ListBullet"/>
+      </w:pPr>
+      <w:r>
+        <w:rPr>
+          <w:b/>
+        </w:rPr>
+        <w:t xml:space="preserve">UC-01  </w:t>
+      </w:r>
+      <w:r>
+        <w:t>ผู้ใช้งาน — อัปโหลดภาพเหล็กเข้าระบบ</w:t>
+      </w:r>
+    </w:p>
+    <w:p>
+      <w:pPr>
+        <w:pStyle w:val="ListBullet"/>
+      </w:pPr>
+      <w:r>
+        <w:rPr>
+          <w:b/>
+        </w:rPr>
+        <w:t xml:space="preserve">UC-02  </w:t>
+      </w:r>
+      <w:r>
+        <w:t>ผู้ใช้งาน — ปรับ confidence threshold / เปิดโหมดตรวจละเอียด</w:t>
+      </w:r>
+    </w:p>
+    <w:p>
+      <w:pPr>
+        <w:pStyle w:val="ListBullet"/>
+      </w:pPr>
+      <w:r>
+        <w:rPr>
+          <w:b/>
+        </w:rPr>
+        <w:t xml:space="preserve">UC-03  </w:t>
+      </w:r>
+      <w:r>
+        <w:t>ผู้ใช้งาน — สั่งตรวจภาพ (ระบบรัน Stage 1 + Stage 2)  «include» UC-01</w:t>
+      </w:r>
+    </w:p>
+    <w:p>
+      <w:pPr>
+        <w:pStyle w:val="ListBullet"/>
+      </w:pPr>
+      <w:r>
+        <w:rPr>
+          <w:b/>
+        </w:rPr>
+        <w:t xml:space="preserve">UC-04  </w:t>
+      </w:r>
+      <w:r>
+        <w:t>ผู้ใช้งาน — ดูผล: กรอบ + ชนิดตำหนิ + ระดับความเสี่ยง + ภาพ Stage 1  «include» UC-03</w:t>
+      </w:r>
+    </w:p>
+    <w:p>
+      <w:pPr>
+        <w:pStyle w:val="ListBullet"/>
+      </w:pPr>
+      <w:r>
+        <w:rPr>
+          <w:b/>
+        </w:rPr>
+        <w:t xml:space="preserve">UC-05  </w:t>
+      </w:r>
+      <w:r>
+        <w:t>ผู้ใช้งาน — บันทึก/ส่งออกผล (ภาพ + JSON)</w:t>
+      </w:r>
+    </w:p>
+    <w:p>
+      <w:pPr>
+        <w:pStyle w:val="ListBullet"/>
+      </w:pPr>
+      <w:r>
+        <w:rPr>
+          <w:b/>
+        </w:rPr>
+        <w:t xml:space="preserve">UC-06  </w:t>
+      </w:r>
+      <w:r>
+        <w:t>ผู้พัฒนา — เตรียม dataset (merge → resplit → fix_labels → grayscale → oversample)</w:t>
+      </w:r>
+    </w:p>
+    <w:p>
+      <w:pPr>
+        <w:pStyle w:val="ListBullet"/>
+      </w:pPr>
+      <w:r>
+        <w:rPr>
+          <w:b/>
+        </w:rPr>
+        <w:t xml:space="preserve">UC-07  </w:t>
+      </w:r>
+      <w:r>
+        <w:t>ผู้พัฒนา — เทรนโมเดล Stage 2 (train.py)</w:t>
+      </w:r>
+    </w:p>
+    <w:p>
+      <w:pPr>
+        <w:pStyle w:val="ListBullet"/>
+      </w:pPr>
+      <w:r>
+        <w:rPr>
+          <w:b/>
+        </w:rPr>
+        <w:t xml:space="preserve">UC-08  </w:t>
+      </w:r>
+      <w:r>
+        <w:t>ผู้พัฒนา — วัดผล mAP / F1 (evaluate.py)</w:t>
+      </w:r>
+    </w:p>
+    <w:p>
+      <w:pPr>
+        <w:pStyle w:val="ListBullet"/>
+      </w:pPr>
+      <w:r>
+        <w:rPr>
+          <w:b/>
+        </w:rPr>
+        <w:t xml:space="preserve">UC-09  </w:t>
+      </w:r>
+      <w:r>
+        <w:t>ผู้พัฒนา — หา per-class confidence threshold (tune_thresholds.py)</w:t>
+      </w:r>
+    </w:p>
+    <w:p>
+      <w:pPr>
+        <w:pStyle w:val="ListBullet"/>
+      </w:pPr>
+      <w:r>
+        <w:rPr>
+          <w:b/>
+        </w:rPr>
+        <w:t xml:space="preserve">UC-10  </w:t>
+      </w:r>
+      <w:r>
+        <w:t>ผู้พัฒนา — วัด Stage 1 เชิงตัวเลข / วัดกับภาพถ่ายจริง (evaluate_stage1.py, evaluate_real.py)</w:t>
+      </w:r>
+    </w:p>
+    <w:p>
+      <w:pPr>
+        <w:pStyle w:val="ListBullet"/>
+      </w:pPr>
+      <w:r>
+        <w:rPr>
+          <w:b/>
+        </w:rPr>
+        <w:t xml:space="preserve">UC-11  </w:t>
+      </w:r>
+      <w:r>
+        <w:t>ผู้พัฒนา — สร้างรูป/เอกสารประกอบ (make_figures / make_diagrams_doc / make_uml_doc / make_design_doc)</w:t>
       </w:r>
     </w:p>
     <w:p>
@@ -2417,10 +2962,181 @@
     </w:p>
     <w:p>
       <w:pPr>
+        <w:jc w:val="center"/>
+      </w:pPr>
+      <w:r>
+        <w:rPr>
+          <w:i/>
+          <w:sz w:val="18"/>
+        </w:rPr>
+        <w:t>Use Case Diagram</w:t>
+      </w:r>
+    </w:p>
+    <w:p>
+      <w:pPr>
         <w:pStyle w:val="Heading2"/>
       </w:pPr>
       <w:r>
         <w:t>6.2 Flowchart — การประมวลผล 1 ภาพ (process_image / analyze)</w:t>
+      </w:r>
+    </w:p>
+    <w:p>
+      <w:r>
+        <w:t>ลำดับขั้น (แยกเป็นข้อ):</w:t>
+      </w:r>
+    </w:p>
+    <w:p>
+      <w:pPr>
+        <w:pStyle w:val="ListBullet"/>
+      </w:pPr>
+      <w:r>
+        <w:rPr>
+          <w:b/>
+        </w:rPr>
+        <w:t xml:space="preserve">F-01  </w:t>
+      </w:r>
+      <w:r>
+        <w:t>อ่านภาพ (cv2.imread) ; ถ้าเปิดไม่ได้ → จบ</w:t>
+      </w:r>
+    </w:p>
+    <w:p>
+      <w:pPr>
+        <w:pStyle w:val="ListBullet"/>
+      </w:pPr>
+      <w:r>
+        <w:rPr>
+          <w:b/>
+        </w:rPr>
+        <w:t xml:space="preserve">F-02  </w:t>
+      </w:r>
+      <w:r>
+        <w:t>Stage 1: run_stage1() → metal mask</w:t>
+      </w:r>
+    </w:p>
+    <w:p>
+      <w:pPr>
+        <w:pStyle w:val="ListBullet"/>
+      </w:pPr>
+      <w:r>
+        <w:rPr>
+          <w:b/>
+        </w:rPr>
+        <w:t xml:space="preserve">F-03  </w:t>
+      </w:r>
+      <w:r>
+        <w:t>build_regions(mask, image.shape, min_metal_ratio) → boxes, meta</w:t>
+      </w:r>
+    </w:p>
+    <w:p>
+      <w:pPr>
+        <w:pStyle w:val="ListBullet"/>
+      </w:pPr>
+      <w:r>
+        <w:rPr>
+          <w:b/>
+        </w:rPr>
+        <w:t xml:space="preserve">F-04  </w:t>
+      </w:r>
+      <w:r>
+        <w:t>ตัดสินใจ: metal_ratio &lt; 0.05 หรือไม่พบกรอบ? → ใช่: boxes += (0,0,W,H) (fallback) / ไม่ใช่: ใช้ boxes เดิม</w:t>
+      </w:r>
+    </w:p>
+    <w:p>
+      <w:pPr>
+        <w:pStyle w:val="ListBullet"/>
+      </w:pPr>
+      <w:r>
+        <w:rPr>
+          <w:b/>
+        </w:rPr>
+        <w:t xml:space="preserve">F-05  </w:t>
+      </w:r>
+      <w:r>
+        <w:t>Pass 1 — วนแต่ละ region: crop ภาพ</w:t>
+      </w:r>
+    </w:p>
+    <w:p>
+      <w:pPr>
+        <w:pStyle w:val="ListBullet"/>
+      </w:pPr>
+      <w:r>
+        <w:rPr>
+          <w:b/>
+        </w:rPr>
+        <w:t xml:space="preserve">F-06  </w:t>
+      </w:r>
+      <w:r>
+        <w:t>run_stage2(): [ถ้าโมเดล grayscale → แปลง crop เป็น gray] · YOLO predict · กรอง score &lt; class_conf[cls]</w:t>
+      </w:r>
+    </w:p>
+    <w:p>
+      <w:pPr>
+        <w:pStyle w:val="ListBullet"/>
+      </w:pPr>
+      <w:r>
+        <w:rPr>
+          <w:b/>
+        </w:rPr>
+        <w:t xml:space="preserve">F-07  </w:t>
+      </w:r>
+      <w:r>
+        <w:t>แปลง bbox_xyxy_crop → bbox_xyxy_global (บวก offset ของ region)</w:t>
+      </w:r>
+    </w:p>
+    <w:p>
+      <w:pPr>
+        <w:pStyle w:val="ListBullet"/>
+      </w:pPr>
+      <w:r>
+        <w:rPr>
+          <w:b/>
+        </w:rPr>
+        <w:t xml:space="preserve">F-08  </w:t>
+      </w:r>
+      <w:r>
+        <w:t>รวม detection ทุก region → cross_region_nms(flat, iou=0.5)</w:t>
+      </w:r>
+    </w:p>
+    <w:p>
+      <w:pPr>
+        <w:pStyle w:val="ListBullet"/>
+      </w:pPr>
+      <w:r>
+        <w:rPr>
+          <w:b/>
+        </w:rPr>
+        <w:t xml:space="preserve">F-09  </w:t>
+      </w:r>
+      <w:r>
+        <w:t>Pass 2 — วนแต่ละ region: ตัดสินใจ มี detection ที่รอด NMS?</w:t>
+      </w:r>
+    </w:p>
+    <w:p>
+      <w:pPr>
+        <w:pStyle w:val="ListBullet"/>
+      </w:pPr>
+      <w:r>
+        <w:rPr>
+          <w:b/>
+        </w:rPr>
+        <w:t xml:space="preserve">F-10  </w:t>
+      </w:r>
+      <w:r>
+        <w:t xml:space="preserve">   ใช่ → วาดกรอบเขียว + กรอบแดง + ป้ายไทย + เก็บลง rows[] / ไม่ → วาดกรอบเขียว + ป้าย "เหล็ก #k ปกติ"</w:t>
+      </w:r>
+    </w:p>
+    <w:p>
+      <w:pPr>
+        <w:pStyle w:val="ListBullet"/>
+      </w:pPr>
+      <w:r>
+        <w:rPr>
+          <w:b/>
+        </w:rPr>
+        <w:t xml:space="preserve">F-11  </w:t>
+      </w:r>
+      <w:r>
+        <w:t>CLI: เขียน *_result.jpg + *_result.json (โหมด --folder เพิ่ม _index.json) — UI: คืน (annotated, stage1_img, verdict, rows)</w:t>
       </w:r>
     </w:p>
     <w:p>
@@ -2460,6 +3176,18 @@
             </a:graphic>
           </wp:inline>
         </w:drawing>
+      </w:r>
+    </w:p>
+    <w:p>
+      <w:pPr>
+        <w:jc w:val="center"/>
+      </w:pPr>
+      <w:r>
+        <w:rPr>
+          <w:i/>
+          <w:sz w:val="18"/>
+        </w:rPr>
+        <w:t>Activity Diagram</w:t>
       </w:r>
     </w:p>
     <w:p>

</xml_diff>

<commit_message>
Demo prep: curated per-class examples, shareable app.py, DB design doc, seed real_test
- app.py: add --share / --port / --local-only flags + LAN IP hint so the
  Gradio demo can be opened from other devices (same wifi or public tunnel)
- test_images/: add one verified example per defect class (8 files), each
  confirmed through analyze() at default settings (77-93% confidence)
- docs/database_design.docx + make_database_doc.py: standalone Database Design
  document (field-level data dictionary, real sample result JSON, equivalent
  relational schema + normalization note); design_document.docx appendix links to it
- real_test/: seed first 2 scene-level real photos with image-level labels
  (real_001 rust;patches, real_002 scratches) + SOURCES.md placeholders

Co-Authored-By: Claude Sonnet 5 <noreply@anthropic.com>
Claude-Session: https://claude.ai/code/session_01FfsV4XBJfKXZ4w8uj3xAca
</commit_message>
<xml_diff>
--- a/docs/design_document.docx
+++ b/docs/design_document.docx
@@ -3309,6 +3309,11 @@
     </w:p>
     <w:p>
       <w:r>
+        <w:t>• docs/database_design.docx — รายละเอียด Database Design เต็ม (ขยายจากหัวข้อ 4 ข้างบน): Data Dictionary ระดับฟิลด์, ตัวอย่างข้อมูลจริง, Relational Schema เทียบเท่าถ้าย้ายไป RDBMS</w:t>
+      </w:r>
+    </w:p>
+    <w:p>
+      <w:r>
         <w:t>• README.md / prepare_data.md / NEXT_STEPS.md / thesis_notes.md — คู่มือและบันทึกการทดลอง</w:t>
       </w:r>
     </w:p>

</xml_diff>